<commit_message>
docs: runbook as PDF with generated contents
</commit_message>
<xml_diff>
--- a/docs/Velocity_Deployment_Integration_Runbook.docx
+++ b/docs/Velocity_Deployment_Integration_Runbook.docx
@@ -95,25 +95,2674 @@
         <w:t xml:space="preserve">Contents</w:t>
       </w:r>
     </w:p>
-    <w:sdt>
-      <w:sdtPr>
-        <w:alias w:val="Contents"/>
-      </w:sdtPr>
-      <w:sdtContent>
-        <w:p>
-          <w:r>
-            <w:fldChar w:fldCharType="begin" w:dirty="true"/>
-            <w:instrText xml:space="preserve">TOC \h \o "1-2"</w:instrText>
-            <w:fldChar w:fldCharType="separate"/>
-          </w:r>
-        </w:p>
-        <w:p>
-          <w:r>
-            <w:fldChar w:fldCharType="end"/>
-          </w:r>
-        </w:p>
-      </w:sdtContent>
-    </w:sdt>
+    <w:p>
+      <w:pPr>
+        <w:tabs>
+          <w:tab w:val="right" w:pos="9026" w:leader="dot"/>
+        </w:tabs>
+        <w:spacing w:after="60" w:before="100"/>
+        <w:ind w:left="0"/>
+      </w:pPr>
+      <w:r>
+        <w:rPr>
+          <w:b/>
+          <w:bCs/>
+          <w:color w:val="0B1F4B"/>
+          <w:sz w:val="21"/>
+          <w:szCs w:val="21"/>
+        </w:rPr>
+        <w:t xml:space="preserve">1. How to use this document</w:t>
+      </w:r>
+      <w:r>
+        <w:rPr>
+          <w:b/>
+          <w:bCs/>
+          <w:color w:val="0B1F4B"/>
+          <w:sz w:val="21"/>
+          <w:szCs w:val="21"/>
+        </w:rPr>
+        <w:t xml:space="preserve">	4</w:t>
+      </w:r>
+    </w:p>
+    <w:p>
+      <w:pPr>
+        <w:tabs>
+          <w:tab w:val="right" w:pos="9026" w:leader="dot"/>
+        </w:tabs>
+        <w:spacing w:after="60" w:before="100"/>
+        <w:ind w:left="0"/>
+      </w:pPr>
+      <w:r>
+        <w:rPr>
+          <w:b/>
+          <w:bCs/>
+          <w:color w:val="0B1F4B"/>
+          <w:sz w:val="21"/>
+          <w:szCs w:val="21"/>
+        </w:rPr>
+        <w:t xml:space="preserve">2. System overview</w:t>
+      </w:r>
+      <w:r>
+        <w:rPr>
+          <w:b/>
+          <w:bCs/>
+          <w:color w:val="0B1F4B"/>
+          <w:sz w:val="21"/>
+          <w:szCs w:val="21"/>
+        </w:rPr>
+        <w:t xml:space="preserve">	5</w:t>
+      </w:r>
+    </w:p>
+    <w:p>
+      <w:pPr>
+        <w:tabs>
+          <w:tab w:val="right" w:pos="9026" w:leader="dot"/>
+        </w:tabs>
+        <w:spacing w:after="20" w:before="0"/>
+        <w:ind w:left="340"/>
+      </w:pPr>
+      <w:r>
+        <w:rPr>
+          <w:b w:val="false"/>
+          <w:bCs w:val="false"/>
+          <w:color w:val="6B7280"/>
+          <w:sz w:val="19"/>
+          <w:szCs w:val="19"/>
+        </w:rPr>
+        <w:t xml:space="preserve">2.1 What the product does</w:t>
+      </w:r>
+      <w:r>
+        <w:rPr>
+          <w:b w:val="false"/>
+          <w:bCs w:val="false"/>
+          <w:color w:val="6B7280"/>
+          <w:sz w:val="19"/>
+          <w:szCs w:val="19"/>
+        </w:rPr>
+        <w:t xml:space="preserve">	5</w:t>
+      </w:r>
+    </w:p>
+    <w:p>
+      <w:pPr>
+        <w:tabs>
+          <w:tab w:val="right" w:pos="9026" w:leader="dot"/>
+        </w:tabs>
+        <w:spacing w:after="20" w:before="0"/>
+        <w:ind w:left="340"/>
+      </w:pPr>
+      <w:r>
+        <w:rPr>
+          <w:b w:val="false"/>
+          <w:bCs w:val="false"/>
+          <w:color w:val="6B7280"/>
+          <w:sz w:val="19"/>
+          <w:szCs w:val="19"/>
+        </w:rPr>
+        <w:t xml:space="preserve">2.2 Runtime topology</w:t>
+      </w:r>
+      <w:r>
+        <w:rPr>
+          <w:b w:val="false"/>
+          <w:bCs w:val="false"/>
+          <w:color w:val="6B7280"/>
+          <w:sz w:val="19"/>
+          <w:szCs w:val="19"/>
+        </w:rPr>
+        <w:t xml:space="preserve">	5</w:t>
+      </w:r>
+    </w:p>
+    <w:p>
+      <w:pPr>
+        <w:tabs>
+          <w:tab w:val="right" w:pos="9026" w:leader="dot"/>
+        </w:tabs>
+        <w:spacing w:after="20" w:before="0"/>
+        <w:ind w:left="340"/>
+      </w:pPr>
+      <w:r>
+        <w:rPr>
+          <w:b w:val="false"/>
+          <w:bCs w:val="false"/>
+          <w:color w:val="6B7280"/>
+          <w:sz w:val="19"/>
+          <w:szCs w:val="19"/>
+        </w:rPr>
+        <w:t xml:space="preserve">2.3 Repository layout</w:t>
+      </w:r>
+      <w:r>
+        <w:rPr>
+          <w:b w:val="false"/>
+          <w:bCs w:val="false"/>
+          <w:color w:val="6B7280"/>
+          <w:sz w:val="19"/>
+          <w:szCs w:val="19"/>
+        </w:rPr>
+        <w:t xml:space="preserve">	5</w:t>
+      </w:r>
+    </w:p>
+    <w:p>
+      <w:pPr>
+        <w:tabs>
+          <w:tab w:val="right" w:pos="9026" w:leader="dot"/>
+        </w:tabs>
+        <w:spacing w:after="60" w:before="100"/>
+        <w:ind w:left="0"/>
+      </w:pPr>
+      <w:r>
+        <w:rPr>
+          <w:b/>
+          <w:bCs/>
+          <w:color w:val="0B1F4B"/>
+          <w:sz w:val="21"/>
+          <w:szCs w:val="21"/>
+        </w:rPr>
+        <w:t xml:space="preserve">3. Prerequisites</w:t>
+      </w:r>
+      <w:r>
+        <w:rPr>
+          <w:b/>
+          <w:bCs/>
+          <w:color w:val="0B1F4B"/>
+          <w:sz w:val="21"/>
+          <w:szCs w:val="21"/>
+        </w:rPr>
+        <w:t xml:space="preserve">	7</w:t>
+      </w:r>
+    </w:p>
+    <w:p>
+      <w:pPr>
+        <w:tabs>
+          <w:tab w:val="right" w:pos="9026" w:leader="dot"/>
+        </w:tabs>
+        <w:spacing w:after="20" w:before="0"/>
+        <w:ind w:left="340"/>
+      </w:pPr>
+      <w:r>
+        <w:rPr>
+          <w:b w:val="false"/>
+          <w:bCs w:val="false"/>
+          <w:color w:val="6B7280"/>
+          <w:sz w:val="19"/>
+          <w:szCs w:val="19"/>
+        </w:rPr>
+        <w:t xml:space="preserve">3.1 Tooling on the developer machine</w:t>
+      </w:r>
+      <w:r>
+        <w:rPr>
+          <w:b w:val="false"/>
+          <w:bCs w:val="false"/>
+          <w:color w:val="6B7280"/>
+          <w:sz w:val="19"/>
+          <w:szCs w:val="19"/>
+        </w:rPr>
+        <w:t xml:space="preserve">	7</w:t>
+      </w:r>
+    </w:p>
+    <w:p>
+      <w:pPr>
+        <w:tabs>
+          <w:tab w:val="right" w:pos="9026" w:leader="dot"/>
+        </w:tabs>
+        <w:spacing w:after="20" w:before="0"/>
+        <w:ind w:left="340"/>
+      </w:pPr>
+      <w:r>
+        <w:rPr>
+          <w:b w:val="false"/>
+          <w:bCs w:val="false"/>
+          <w:color w:val="6B7280"/>
+          <w:sz w:val="19"/>
+          <w:szCs w:val="19"/>
+        </w:rPr>
+        <w:t xml:space="preserve">3.2 Accounts to create before go-live</w:t>
+      </w:r>
+      <w:r>
+        <w:rPr>
+          <w:b w:val="false"/>
+          <w:bCs w:val="false"/>
+          <w:color w:val="6B7280"/>
+          <w:sz w:val="19"/>
+          <w:szCs w:val="19"/>
+        </w:rPr>
+        <w:t xml:space="preserve">	7</w:t>
+      </w:r>
+    </w:p>
+    <w:p>
+      <w:pPr>
+        <w:tabs>
+          <w:tab w:val="right" w:pos="9026" w:leader="dot"/>
+        </w:tabs>
+        <w:spacing w:after="60" w:before="100"/>
+        <w:ind w:left="0"/>
+      </w:pPr>
+      <w:r>
+        <w:rPr>
+          <w:b/>
+          <w:bCs/>
+          <w:color w:val="0B1F4B"/>
+          <w:sz w:val="21"/>
+          <w:szCs w:val="21"/>
+        </w:rPr>
+        <w:t xml:space="preserve">4. Source control and workflow</w:t>
+      </w:r>
+      <w:r>
+        <w:rPr>
+          <w:b/>
+          <w:bCs/>
+          <w:color w:val="0B1F4B"/>
+          <w:sz w:val="21"/>
+          <w:szCs w:val="21"/>
+        </w:rPr>
+        <w:t xml:space="preserve">	8</w:t>
+      </w:r>
+    </w:p>
+    <w:p>
+      <w:pPr>
+        <w:tabs>
+          <w:tab w:val="right" w:pos="9026" w:leader="dot"/>
+        </w:tabs>
+        <w:spacing w:after="20" w:before="0"/>
+        <w:ind w:left="340"/>
+      </w:pPr>
+      <w:r>
+        <w:rPr>
+          <w:b w:val="false"/>
+          <w:bCs w:val="false"/>
+          <w:color w:val="6B7280"/>
+          <w:sz w:val="19"/>
+          <w:szCs w:val="19"/>
+        </w:rPr>
+        <w:t xml:space="preserve">4.1 First push</w:t>
+      </w:r>
+      <w:r>
+        <w:rPr>
+          <w:b w:val="false"/>
+          <w:bCs w:val="false"/>
+          <w:color w:val="6B7280"/>
+          <w:sz w:val="19"/>
+          <w:szCs w:val="19"/>
+        </w:rPr>
+        <w:t xml:space="preserve">	8</w:t>
+      </w:r>
+    </w:p>
+    <w:p>
+      <w:pPr>
+        <w:tabs>
+          <w:tab w:val="right" w:pos="9026" w:leader="dot"/>
+        </w:tabs>
+        <w:spacing w:after="20" w:before="0"/>
+        <w:ind w:left="340"/>
+      </w:pPr>
+      <w:r>
+        <w:rPr>
+          <w:b w:val="false"/>
+          <w:bCs w:val="false"/>
+          <w:color w:val="6B7280"/>
+          <w:sz w:val="19"/>
+          <w:szCs w:val="19"/>
+        </w:rPr>
+        <w:t xml:space="preserve">4.2 Branching and review</w:t>
+      </w:r>
+      <w:r>
+        <w:rPr>
+          <w:b w:val="false"/>
+          <w:bCs w:val="false"/>
+          <w:color w:val="6B7280"/>
+          <w:sz w:val="19"/>
+          <w:szCs w:val="19"/>
+        </w:rPr>
+        <w:t xml:space="preserve">	8</w:t>
+      </w:r>
+    </w:p>
+    <w:p>
+      <w:pPr>
+        <w:tabs>
+          <w:tab w:val="right" w:pos="9026" w:leader="dot"/>
+        </w:tabs>
+        <w:spacing w:after="20" w:before="0"/>
+        <w:ind w:left="340"/>
+      </w:pPr>
+      <w:r>
+        <w:rPr>
+          <w:b w:val="false"/>
+          <w:bCs w:val="false"/>
+          <w:color w:val="6B7280"/>
+          <w:sz w:val="19"/>
+          <w:szCs w:val="19"/>
+        </w:rPr>
+        <w:t xml:space="preserve">4.3 Routine pull / push commands</w:t>
+      </w:r>
+      <w:r>
+        <w:rPr>
+          <w:b w:val="false"/>
+          <w:bCs w:val="false"/>
+          <w:color w:val="6B7280"/>
+          <w:sz w:val="19"/>
+          <w:szCs w:val="19"/>
+        </w:rPr>
+        <w:t xml:space="preserve">	8</w:t>
+      </w:r>
+    </w:p>
+    <w:p>
+      <w:pPr>
+        <w:tabs>
+          <w:tab w:val="right" w:pos="9026" w:leader="dot"/>
+        </w:tabs>
+        <w:spacing w:after="60" w:before="100"/>
+        <w:ind w:left="0"/>
+      </w:pPr>
+      <w:r>
+        <w:rPr>
+          <w:b/>
+          <w:bCs/>
+          <w:color w:val="0B1F4B"/>
+          <w:sz w:val="21"/>
+          <w:szCs w:val="21"/>
+        </w:rPr>
+        <w:t xml:space="preserve">5. Environment variables</w:t>
+      </w:r>
+      <w:r>
+        <w:rPr>
+          <w:b/>
+          <w:bCs/>
+          <w:color w:val="0B1F4B"/>
+          <w:sz w:val="21"/>
+          <w:szCs w:val="21"/>
+        </w:rPr>
+        <w:t xml:space="preserve">	9</w:t>
+      </w:r>
+    </w:p>
+    <w:p>
+      <w:pPr>
+        <w:tabs>
+          <w:tab w:val="right" w:pos="9026" w:leader="dot"/>
+        </w:tabs>
+        <w:spacing w:after="20" w:before="0"/>
+        <w:ind w:left="340"/>
+      </w:pPr>
+      <w:r>
+        <w:rPr>
+          <w:b w:val="false"/>
+          <w:bCs w:val="false"/>
+          <w:color w:val="6B7280"/>
+          <w:sz w:val="19"/>
+          <w:szCs w:val="19"/>
+        </w:rPr>
+        <w:t xml:space="preserve">5.1 Core (always required)</w:t>
+      </w:r>
+      <w:r>
+        <w:rPr>
+          <w:b w:val="false"/>
+          <w:bCs w:val="false"/>
+          <w:color w:val="6B7280"/>
+          <w:sz w:val="19"/>
+          <w:szCs w:val="19"/>
+        </w:rPr>
+        <w:t xml:space="preserve">	9</w:t>
+      </w:r>
+    </w:p>
+    <w:p>
+      <w:pPr>
+        <w:tabs>
+          <w:tab w:val="right" w:pos="9026" w:leader="dot"/>
+        </w:tabs>
+        <w:spacing w:after="20" w:before="0"/>
+        <w:ind w:left="340"/>
+      </w:pPr>
+      <w:r>
+        <w:rPr>
+          <w:b w:val="false"/>
+          <w:bCs w:val="false"/>
+          <w:color w:val="6B7280"/>
+          <w:sz w:val="19"/>
+          <w:szCs w:val="19"/>
+        </w:rPr>
+        <w:t xml:space="preserve">5.2 Storage</w:t>
+      </w:r>
+      <w:r>
+        <w:rPr>
+          <w:b w:val="false"/>
+          <w:bCs w:val="false"/>
+          <w:color w:val="6B7280"/>
+          <w:sz w:val="19"/>
+          <w:szCs w:val="19"/>
+        </w:rPr>
+        <w:t xml:space="preserve">	9</w:t>
+      </w:r>
+    </w:p>
+    <w:p>
+      <w:pPr>
+        <w:tabs>
+          <w:tab w:val="right" w:pos="9026" w:leader="dot"/>
+        </w:tabs>
+        <w:spacing w:after="20" w:before="0"/>
+        <w:ind w:left="340"/>
+      </w:pPr>
+      <w:r>
+        <w:rPr>
+          <w:b w:val="false"/>
+          <w:bCs w:val="false"/>
+          <w:color w:val="6B7280"/>
+          <w:sz w:val="19"/>
+          <w:szCs w:val="19"/>
+        </w:rPr>
+        <w:t xml:space="preserve">5.3 Providers</w:t>
+      </w:r>
+      <w:r>
+        <w:rPr>
+          <w:b w:val="false"/>
+          <w:bCs w:val="false"/>
+          <w:color w:val="6B7280"/>
+          <w:sz w:val="19"/>
+          <w:szCs w:val="19"/>
+        </w:rPr>
+        <w:t xml:space="preserve">	9</w:t>
+      </w:r>
+    </w:p>
+    <w:p>
+      <w:pPr>
+        <w:tabs>
+          <w:tab w:val="right" w:pos="9026" w:leader="dot"/>
+        </w:tabs>
+        <w:spacing w:after="20" w:before="0"/>
+        <w:ind w:left="340"/>
+      </w:pPr>
+      <w:r>
+        <w:rPr>
+          <w:b w:val="false"/>
+          <w:bCs w:val="false"/>
+          <w:color w:val="6B7280"/>
+          <w:sz w:val="19"/>
+          <w:szCs w:val="19"/>
+        </w:rPr>
+        <w:t xml:space="preserve">5.4 Platform publishing</w:t>
+      </w:r>
+      <w:r>
+        <w:rPr>
+          <w:b w:val="false"/>
+          <w:bCs w:val="false"/>
+          <w:color w:val="6B7280"/>
+          <w:sz w:val="19"/>
+          <w:szCs w:val="19"/>
+        </w:rPr>
+        <w:t xml:space="preserve">	10</w:t>
+      </w:r>
+    </w:p>
+    <w:p>
+      <w:pPr>
+        <w:tabs>
+          <w:tab w:val="right" w:pos="9026" w:leader="dot"/>
+        </w:tabs>
+        <w:spacing w:after="20" w:before="0"/>
+        <w:ind w:left="340"/>
+      </w:pPr>
+      <w:r>
+        <w:rPr>
+          <w:b w:val="false"/>
+          <w:bCs w:val="false"/>
+          <w:color w:val="6B7280"/>
+          <w:sz w:val="19"/>
+          <w:szCs w:val="19"/>
+        </w:rPr>
+        <w:t xml:space="preserve">5.5 Billing, email, auth providers, misc</w:t>
+      </w:r>
+      <w:r>
+        <w:rPr>
+          <w:b w:val="false"/>
+          <w:bCs w:val="false"/>
+          <w:color w:val="6B7280"/>
+          <w:sz w:val="19"/>
+          <w:szCs w:val="19"/>
+        </w:rPr>
+        <w:t xml:space="preserve">	10</w:t>
+      </w:r>
+    </w:p>
+    <w:p>
+      <w:pPr>
+        <w:tabs>
+          <w:tab w:val="right" w:pos="9026" w:leader="dot"/>
+        </w:tabs>
+        <w:spacing w:after="60" w:before="100"/>
+        <w:ind w:left="0"/>
+      </w:pPr>
+      <w:r>
+        <w:rPr>
+          <w:b/>
+          <w:bCs/>
+          <w:color w:val="0B1F4B"/>
+          <w:sz w:val="21"/>
+          <w:szCs w:val="21"/>
+        </w:rPr>
+        <w:t xml:space="preserve">6. Database</w:t>
+      </w:r>
+      <w:r>
+        <w:rPr>
+          <w:b/>
+          <w:bCs/>
+          <w:color w:val="0B1F4B"/>
+          <w:sz w:val="21"/>
+          <w:szCs w:val="21"/>
+        </w:rPr>
+        <w:t xml:space="preserve">	11</w:t>
+      </w:r>
+    </w:p>
+    <w:p>
+      <w:pPr>
+        <w:tabs>
+          <w:tab w:val="right" w:pos="9026" w:leader="dot"/>
+        </w:tabs>
+        <w:spacing w:after="20" w:before="0"/>
+        <w:ind w:left="340"/>
+      </w:pPr>
+      <w:r>
+        <w:rPr>
+          <w:b w:val="false"/>
+          <w:bCs w:val="false"/>
+          <w:color w:val="6B7280"/>
+          <w:sz w:val="19"/>
+          <w:szCs w:val="19"/>
+        </w:rPr>
+        <w:t xml:space="preserve">6.1 Requirements</w:t>
+      </w:r>
+      <w:r>
+        <w:rPr>
+          <w:b w:val="false"/>
+          <w:bCs w:val="false"/>
+          <w:color w:val="6B7280"/>
+          <w:sz w:val="19"/>
+          <w:szCs w:val="19"/>
+        </w:rPr>
+        <w:t xml:space="preserve">	11</w:t>
+      </w:r>
+    </w:p>
+    <w:p>
+      <w:pPr>
+        <w:tabs>
+          <w:tab w:val="right" w:pos="9026" w:leader="dot"/>
+        </w:tabs>
+        <w:spacing w:after="20" w:before="0"/>
+        <w:ind w:left="340"/>
+      </w:pPr>
+      <w:r>
+        <w:rPr>
+          <w:b w:val="false"/>
+          <w:bCs w:val="false"/>
+          <w:color w:val="6B7280"/>
+          <w:sz w:val="19"/>
+          <w:szCs w:val="19"/>
+        </w:rPr>
+        <w:t xml:space="preserve">6.2 Commands</w:t>
+      </w:r>
+      <w:r>
+        <w:rPr>
+          <w:b w:val="false"/>
+          <w:bCs w:val="false"/>
+          <w:color w:val="6B7280"/>
+          <w:sz w:val="19"/>
+          <w:szCs w:val="19"/>
+        </w:rPr>
+        <w:t xml:space="preserve">	11</w:t>
+      </w:r>
+    </w:p>
+    <w:p>
+      <w:pPr>
+        <w:tabs>
+          <w:tab w:val="right" w:pos="9026" w:leader="dot"/>
+        </w:tabs>
+        <w:spacing w:after="20" w:before="0"/>
+        <w:ind w:left="340"/>
+      </w:pPr>
+      <w:r>
+        <w:rPr>
+          <w:b w:val="false"/>
+          <w:bCs w:val="false"/>
+          <w:color w:val="6B7280"/>
+          <w:sz w:val="19"/>
+          <w:szCs w:val="19"/>
+        </w:rPr>
+        <w:t xml:space="preserve">6.3 Schema map (37 tables)</w:t>
+      </w:r>
+      <w:r>
+        <w:rPr>
+          <w:b w:val="false"/>
+          <w:bCs w:val="false"/>
+          <w:color w:val="6B7280"/>
+          <w:sz w:val="19"/>
+          <w:szCs w:val="19"/>
+        </w:rPr>
+        <w:t xml:space="preserve">	11</w:t>
+      </w:r>
+    </w:p>
+    <w:p>
+      <w:pPr>
+        <w:tabs>
+          <w:tab w:val="right" w:pos="9026" w:leader="dot"/>
+        </w:tabs>
+        <w:spacing w:after="20" w:before="0"/>
+        <w:ind w:left="340"/>
+      </w:pPr>
+      <w:r>
+        <w:rPr>
+          <w:b w:val="false"/>
+          <w:bCs w:val="false"/>
+          <w:color w:val="6B7280"/>
+          <w:sz w:val="19"/>
+          <w:szCs w:val="19"/>
+        </w:rPr>
+        <w:t xml:space="preserve">6.4 Backups</w:t>
+      </w:r>
+      <w:r>
+        <w:rPr>
+          <w:b w:val="false"/>
+          <w:bCs w:val="false"/>
+          <w:color w:val="6B7280"/>
+          <w:sz w:val="19"/>
+          <w:szCs w:val="19"/>
+        </w:rPr>
+        <w:t xml:space="preserve">	11</w:t>
+      </w:r>
+    </w:p>
+    <w:p>
+      <w:pPr>
+        <w:tabs>
+          <w:tab w:val="right" w:pos="9026" w:leader="dot"/>
+        </w:tabs>
+        <w:spacing w:after="60" w:before="100"/>
+        <w:ind w:left="0"/>
+      </w:pPr>
+      <w:r>
+        <w:rPr>
+          <w:b/>
+          <w:bCs/>
+          <w:color w:val="0B1F4B"/>
+          <w:sz w:val="21"/>
+          <w:szCs w:val="21"/>
+        </w:rPr>
+        <w:t xml:space="preserve">7. Local development</w:t>
+      </w:r>
+      <w:r>
+        <w:rPr>
+          <w:b/>
+          <w:bCs/>
+          <w:color w:val="0B1F4B"/>
+          <w:sz w:val="21"/>
+          <w:szCs w:val="21"/>
+        </w:rPr>
+        <w:t xml:space="preserve">	12</w:t>
+      </w:r>
+    </w:p>
+    <w:p>
+      <w:pPr>
+        <w:tabs>
+          <w:tab w:val="right" w:pos="9026" w:leader="dot"/>
+        </w:tabs>
+        <w:spacing w:after="20" w:before="0"/>
+        <w:ind w:left="340"/>
+      </w:pPr>
+      <w:r>
+        <w:rPr>
+          <w:b w:val="false"/>
+          <w:bCs w:val="false"/>
+          <w:color w:val="6B7280"/>
+          <w:sz w:val="19"/>
+          <w:szCs w:val="19"/>
+        </w:rPr>
+        <w:t xml:space="preserve">7.1 Fastest path (Docker, mock providers, no external keys)</w:t>
+      </w:r>
+      <w:r>
+        <w:rPr>
+          <w:b w:val="false"/>
+          <w:bCs w:val="false"/>
+          <w:color w:val="6B7280"/>
+          <w:sz w:val="19"/>
+          <w:szCs w:val="19"/>
+        </w:rPr>
+        <w:t xml:space="preserve">	12</w:t>
+      </w:r>
+    </w:p>
+    <w:p>
+      <w:pPr>
+        <w:tabs>
+          <w:tab w:val="right" w:pos="9026" w:leader="dot"/>
+        </w:tabs>
+        <w:spacing w:after="20" w:before="0"/>
+        <w:ind w:left="340"/>
+      </w:pPr>
+      <w:r>
+        <w:rPr>
+          <w:b w:val="false"/>
+          <w:bCs w:val="false"/>
+          <w:color w:val="6B7280"/>
+          <w:sz w:val="19"/>
+          <w:szCs w:val="19"/>
+        </w:rPr>
+        <w:t xml:space="preserve">7.2 Without Docker</w:t>
+      </w:r>
+      <w:r>
+        <w:rPr>
+          <w:b w:val="false"/>
+          <w:bCs w:val="false"/>
+          <w:color w:val="6B7280"/>
+          <w:sz w:val="19"/>
+          <w:szCs w:val="19"/>
+        </w:rPr>
+        <w:t xml:space="preserve">	12</w:t>
+      </w:r>
+    </w:p>
+    <w:p>
+      <w:pPr>
+        <w:tabs>
+          <w:tab w:val="right" w:pos="9026" w:leader="dot"/>
+        </w:tabs>
+        <w:spacing w:after="20" w:before="0"/>
+        <w:ind w:left="340"/>
+      </w:pPr>
+      <w:r>
+        <w:rPr>
+          <w:b w:val="false"/>
+          <w:bCs w:val="false"/>
+          <w:color w:val="6B7280"/>
+          <w:sz w:val="19"/>
+          <w:szCs w:val="19"/>
+        </w:rPr>
+        <w:t xml:space="preserve">7.3 Everyday scripts</w:t>
+      </w:r>
+      <w:r>
+        <w:rPr>
+          <w:b w:val="false"/>
+          <w:bCs w:val="false"/>
+          <w:color w:val="6B7280"/>
+          <w:sz w:val="19"/>
+          <w:szCs w:val="19"/>
+        </w:rPr>
+        <w:t xml:space="preserve">	12</w:t>
+      </w:r>
+    </w:p>
+    <w:p>
+      <w:pPr>
+        <w:tabs>
+          <w:tab w:val="right" w:pos="9026" w:leader="dot"/>
+        </w:tabs>
+        <w:spacing w:after="60" w:before="100"/>
+        <w:ind w:left="0"/>
+      </w:pPr>
+      <w:r>
+        <w:rPr>
+          <w:b/>
+          <w:bCs/>
+          <w:color w:val="0B1F4B"/>
+          <w:sz w:val="21"/>
+          <w:szCs w:val="21"/>
+        </w:rPr>
+        <w:t xml:space="preserve">8. Deployment</w:t>
+      </w:r>
+      <w:r>
+        <w:rPr>
+          <w:b/>
+          <w:bCs/>
+          <w:color w:val="0B1F4B"/>
+          <w:sz w:val="21"/>
+          <w:szCs w:val="21"/>
+        </w:rPr>
+        <w:t xml:space="preserve">	13</w:t>
+      </w:r>
+    </w:p>
+    <w:p>
+      <w:pPr>
+        <w:tabs>
+          <w:tab w:val="right" w:pos="9026" w:leader="dot"/>
+        </w:tabs>
+        <w:spacing w:after="20" w:before="0"/>
+        <w:ind w:left="340"/>
+      </w:pPr>
+      <w:r>
+        <w:rPr>
+          <w:b w:val="false"/>
+          <w:bCs w:val="false"/>
+          <w:color w:val="6B7280"/>
+          <w:sz w:val="19"/>
+          <w:szCs w:val="19"/>
+        </w:rPr>
+        <w:t xml:space="preserve">8.1 Choosing a target</w:t>
+      </w:r>
+      <w:r>
+        <w:rPr>
+          <w:b w:val="false"/>
+          <w:bCs w:val="false"/>
+          <w:color w:val="6B7280"/>
+          <w:sz w:val="19"/>
+          <w:szCs w:val="19"/>
+        </w:rPr>
+        <w:t xml:space="preserve">	13</w:t>
+      </w:r>
+    </w:p>
+    <w:p>
+      <w:pPr>
+        <w:tabs>
+          <w:tab w:val="right" w:pos="9026" w:leader="dot"/>
+        </w:tabs>
+        <w:spacing w:after="20" w:before="0"/>
+        <w:ind w:left="340"/>
+      </w:pPr>
+      <w:r>
+        <w:rPr>
+          <w:b w:val="false"/>
+          <w:bCs w:val="false"/>
+          <w:color w:val="6B7280"/>
+          <w:sz w:val="19"/>
+          <w:szCs w:val="19"/>
+        </w:rPr>
+        <w:t xml:space="preserve">8.2 Render, step by step</w:t>
+      </w:r>
+      <w:r>
+        <w:rPr>
+          <w:b w:val="false"/>
+          <w:bCs w:val="false"/>
+          <w:color w:val="6B7280"/>
+          <w:sz w:val="19"/>
+          <w:szCs w:val="19"/>
+        </w:rPr>
+        <w:t xml:space="preserve">	13</w:t>
+      </w:r>
+    </w:p>
+    <w:p>
+      <w:pPr>
+        <w:tabs>
+          <w:tab w:val="right" w:pos="9026" w:leader="dot"/>
+        </w:tabs>
+        <w:spacing w:after="20" w:before="0"/>
+        <w:ind w:left="340"/>
+      </w:pPr>
+      <w:r>
+        <w:rPr>
+          <w:b w:val="false"/>
+          <w:bCs w:val="false"/>
+          <w:color w:val="6B7280"/>
+          <w:sz w:val="19"/>
+          <w:szCs w:val="19"/>
+        </w:rPr>
+        <w:t xml:space="preserve">8.3 Fly.io</w:t>
+      </w:r>
+      <w:r>
+        <w:rPr>
+          <w:b w:val="false"/>
+          <w:bCs w:val="false"/>
+          <w:color w:val="6B7280"/>
+          <w:sz w:val="19"/>
+          <w:szCs w:val="19"/>
+        </w:rPr>
+        <w:t xml:space="preserve">	13</w:t>
+      </w:r>
+    </w:p>
+    <w:p>
+      <w:pPr>
+        <w:tabs>
+          <w:tab w:val="right" w:pos="9026" w:leader="dot"/>
+        </w:tabs>
+        <w:spacing w:after="20" w:before="0"/>
+        <w:ind w:left="340"/>
+      </w:pPr>
+      <w:r>
+        <w:rPr>
+          <w:b w:val="false"/>
+          <w:bCs w:val="false"/>
+          <w:color w:val="6B7280"/>
+          <w:sz w:val="19"/>
+          <w:szCs w:val="19"/>
+        </w:rPr>
+        <w:t xml:space="preserve">8.4 Single VM</w:t>
+      </w:r>
+      <w:r>
+        <w:rPr>
+          <w:b w:val="false"/>
+          <w:bCs w:val="false"/>
+          <w:color w:val="6B7280"/>
+          <w:sz w:val="19"/>
+          <w:szCs w:val="19"/>
+        </w:rPr>
+        <w:t xml:space="preserve">	13</w:t>
+      </w:r>
+    </w:p>
+    <w:p>
+      <w:pPr>
+        <w:tabs>
+          <w:tab w:val="right" w:pos="9026" w:leader="dot"/>
+        </w:tabs>
+        <w:spacing w:after="20" w:before="0"/>
+        <w:ind w:left="340"/>
+      </w:pPr>
+      <w:r>
+        <w:rPr>
+          <w:b w:val="false"/>
+          <w:bCs w:val="false"/>
+          <w:color w:val="6B7280"/>
+          <w:sz w:val="19"/>
+          <w:szCs w:val="19"/>
+        </w:rPr>
+        <w:t xml:space="preserve">8.5 Post-deploy verification</w:t>
+      </w:r>
+      <w:r>
+        <w:rPr>
+          <w:b w:val="false"/>
+          <w:bCs w:val="false"/>
+          <w:color w:val="6B7280"/>
+          <w:sz w:val="19"/>
+          <w:szCs w:val="19"/>
+        </w:rPr>
+        <w:t xml:space="preserve">	14</w:t>
+      </w:r>
+    </w:p>
+    <w:p>
+      <w:pPr>
+        <w:tabs>
+          <w:tab w:val="right" w:pos="9026" w:leader="dot"/>
+        </w:tabs>
+        <w:spacing w:after="60" w:before="100"/>
+        <w:ind w:left="0"/>
+      </w:pPr>
+      <w:r>
+        <w:rPr>
+          <w:b/>
+          <w:bCs/>
+          <w:color w:val="0B1F4B"/>
+          <w:sz w:val="21"/>
+          <w:szCs w:val="21"/>
+        </w:rPr>
+        <w:t xml:space="preserve">9. Integrating the providers</w:t>
+      </w:r>
+      <w:r>
+        <w:rPr>
+          <w:b/>
+          <w:bCs/>
+          <w:color w:val="0B1F4B"/>
+          <w:sz w:val="21"/>
+          <w:szCs w:val="21"/>
+        </w:rPr>
+        <w:t xml:space="preserve">	15</w:t>
+      </w:r>
+    </w:p>
+    <w:p>
+      <w:pPr>
+        <w:tabs>
+          <w:tab w:val="right" w:pos="9026" w:leader="dot"/>
+        </w:tabs>
+        <w:spacing w:after="20" w:before="0"/>
+        <w:ind w:left="340"/>
+      </w:pPr>
+      <w:r>
+        <w:rPr>
+          <w:b w:val="false"/>
+          <w:bCs w:val="false"/>
+          <w:color w:val="6B7280"/>
+          <w:sz w:val="19"/>
+          <w:szCs w:val="19"/>
+        </w:rPr>
+        <w:t xml:space="preserve">9.1 Anthropic — profiles and copywriting</w:t>
+      </w:r>
+      <w:r>
+        <w:rPr>
+          <w:b w:val="false"/>
+          <w:bCs w:val="false"/>
+          <w:color w:val="6B7280"/>
+          <w:sz w:val="19"/>
+          <w:szCs w:val="19"/>
+        </w:rPr>
+        <w:t xml:space="preserve">	15</w:t>
+      </w:r>
+    </w:p>
+    <w:p>
+      <w:pPr>
+        <w:tabs>
+          <w:tab w:val="right" w:pos="9026" w:leader="dot"/>
+        </w:tabs>
+        <w:spacing w:after="20" w:before="0"/>
+        <w:ind w:left="340"/>
+      </w:pPr>
+      <w:r>
+        <w:rPr>
+          <w:b w:val="false"/>
+          <w:bCs w:val="false"/>
+          <w:color w:val="6B7280"/>
+          <w:sz w:val="19"/>
+          <w:szCs w:val="19"/>
+        </w:rPr>
+        <w:t xml:space="preserve">9.2 Firecrawl — crawler fallback</w:t>
+      </w:r>
+      <w:r>
+        <w:rPr>
+          <w:b w:val="false"/>
+          <w:bCs w:val="false"/>
+          <w:color w:val="6B7280"/>
+          <w:sz w:val="19"/>
+          <w:szCs w:val="19"/>
+        </w:rPr>
+        <w:t xml:space="preserve">	15</w:t>
+      </w:r>
+    </w:p>
+    <w:p>
+      <w:pPr>
+        <w:tabs>
+          <w:tab w:val="right" w:pos="9026" w:leader="dot"/>
+        </w:tabs>
+        <w:spacing w:after="20" w:before="0"/>
+        <w:ind w:left="340"/>
+      </w:pPr>
+      <w:r>
+        <w:rPr>
+          <w:b w:val="false"/>
+          <w:bCs w:val="false"/>
+          <w:color w:val="6B7280"/>
+          <w:sz w:val="19"/>
+          <w:szCs w:val="19"/>
+        </w:rPr>
+        <w:t xml:space="preserve">9.3 ElevenLabs — voice</w:t>
+      </w:r>
+      <w:r>
+        <w:rPr>
+          <w:b w:val="false"/>
+          <w:bCs w:val="false"/>
+          <w:color w:val="6B7280"/>
+          <w:sz w:val="19"/>
+          <w:szCs w:val="19"/>
+        </w:rPr>
+        <w:t xml:space="preserve">	15</w:t>
+      </w:r>
+    </w:p>
+    <w:p>
+      <w:pPr>
+        <w:tabs>
+          <w:tab w:val="right" w:pos="9026" w:leader="dot"/>
+        </w:tabs>
+        <w:spacing w:after="20" w:before="0"/>
+        <w:ind w:left="340"/>
+      </w:pPr>
+      <w:r>
+        <w:rPr>
+          <w:b w:val="false"/>
+          <w:bCs w:val="false"/>
+          <w:color w:val="6B7280"/>
+          <w:sz w:val="19"/>
+          <w:szCs w:val="19"/>
+        </w:rPr>
+        <w:t xml:space="preserve">9.4 Talking-head video vendor</w:t>
+      </w:r>
+      <w:r>
+        <w:rPr>
+          <w:b w:val="false"/>
+          <w:bCs w:val="false"/>
+          <w:color w:val="6B7280"/>
+          <w:sz w:val="19"/>
+          <w:szCs w:val="19"/>
+        </w:rPr>
+        <w:t xml:space="preserve">	15</w:t>
+      </w:r>
+    </w:p>
+    <w:p>
+      <w:pPr>
+        <w:tabs>
+          <w:tab w:val="right" w:pos="9026" w:leader="dot"/>
+        </w:tabs>
+        <w:spacing w:after="20" w:before="0"/>
+        <w:ind w:left="340"/>
+      </w:pPr>
+      <w:r>
+        <w:rPr>
+          <w:b w:val="false"/>
+          <w:bCs w:val="false"/>
+          <w:color w:val="6B7280"/>
+          <w:sz w:val="19"/>
+          <w:szCs w:val="19"/>
+        </w:rPr>
+        <w:t xml:space="preserve">9.5 Image generation (AI Studio and characters)</w:t>
+      </w:r>
+      <w:r>
+        <w:rPr>
+          <w:b w:val="false"/>
+          <w:bCs w:val="false"/>
+          <w:color w:val="6B7280"/>
+          <w:sz w:val="19"/>
+          <w:szCs w:val="19"/>
+        </w:rPr>
+        <w:t xml:space="preserve">	15</w:t>
+      </w:r>
+    </w:p>
+    <w:p>
+      <w:pPr>
+        <w:tabs>
+          <w:tab w:val="right" w:pos="9026" w:leader="dot"/>
+        </w:tabs>
+        <w:spacing w:after="20" w:before="0"/>
+        <w:ind w:left="340"/>
+      </w:pPr>
+      <w:r>
+        <w:rPr>
+          <w:b w:val="false"/>
+          <w:bCs w:val="false"/>
+          <w:color w:val="6B7280"/>
+          <w:sz w:val="19"/>
+          <w:szCs w:val="19"/>
+        </w:rPr>
+        <w:t xml:space="preserve">9.6 TikTok</w:t>
+      </w:r>
+      <w:r>
+        <w:rPr>
+          <w:b w:val="false"/>
+          <w:bCs w:val="false"/>
+          <w:color w:val="6B7280"/>
+          <w:sz w:val="19"/>
+          <w:szCs w:val="19"/>
+        </w:rPr>
+        <w:t xml:space="preserve">	15</w:t>
+      </w:r>
+    </w:p>
+    <w:p>
+      <w:pPr>
+        <w:tabs>
+          <w:tab w:val="right" w:pos="9026" w:leader="dot"/>
+        </w:tabs>
+        <w:spacing w:after="20" w:before="0"/>
+        <w:ind w:left="340"/>
+      </w:pPr>
+      <w:r>
+        <w:rPr>
+          <w:b w:val="false"/>
+          <w:bCs w:val="false"/>
+          <w:color w:val="6B7280"/>
+          <w:sz w:val="19"/>
+          <w:szCs w:val="19"/>
+        </w:rPr>
+        <w:t xml:space="preserve">9.7 Instagram Reels (Meta)</w:t>
+      </w:r>
+      <w:r>
+        <w:rPr>
+          <w:b w:val="false"/>
+          <w:bCs w:val="false"/>
+          <w:color w:val="6B7280"/>
+          <w:sz w:val="19"/>
+          <w:szCs w:val="19"/>
+        </w:rPr>
+        <w:t xml:space="preserve">	16</w:t>
+      </w:r>
+    </w:p>
+    <w:p>
+      <w:pPr>
+        <w:tabs>
+          <w:tab w:val="right" w:pos="9026" w:leader="dot"/>
+        </w:tabs>
+        <w:spacing w:after="20" w:before="0"/>
+        <w:ind w:left="340"/>
+      </w:pPr>
+      <w:r>
+        <w:rPr>
+          <w:b w:val="false"/>
+          <w:bCs w:val="false"/>
+          <w:color w:val="6B7280"/>
+          <w:sz w:val="19"/>
+          <w:szCs w:val="19"/>
+        </w:rPr>
+        <w:t xml:space="preserve">9.8 YouTube Shorts</w:t>
+      </w:r>
+      <w:r>
+        <w:rPr>
+          <w:b w:val="false"/>
+          <w:bCs w:val="false"/>
+          <w:color w:val="6B7280"/>
+          <w:sz w:val="19"/>
+          <w:szCs w:val="19"/>
+        </w:rPr>
+        <w:t xml:space="preserve">	16</w:t>
+      </w:r>
+    </w:p>
+    <w:p>
+      <w:pPr>
+        <w:tabs>
+          <w:tab w:val="right" w:pos="9026" w:leader="dot"/>
+        </w:tabs>
+        <w:spacing w:after="20" w:before="0"/>
+        <w:ind w:left="340"/>
+      </w:pPr>
+      <w:r>
+        <w:rPr>
+          <w:b w:val="false"/>
+          <w:bCs w:val="false"/>
+          <w:color w:val="6B7280"/>
+          <w:sz w:val="19"/>
+          <w:szCs w:val="19"/>
+        </w:rPr>
+        <w:t xml:space="preserve">9.9 LinkedIn</w:t>
+      </w:r>
+      <w:r>
+        <w:rPr>
+          <w:b w:val="false"/>
+          <w:bCs w:val="false"/>
+          <w:color w:val="6B7280"/>
+          <w:sz w:val="19"/>
+          <w:szCs w:val="19"/>
+        </w:rPr>
+        <w:t xml:space="preserve">	16</w:t>
+      </w:r>
+    </w:p>
+    <w:p>
+      <w:pPr>
+        <w:tabs>
+          <w:tab w:val="right" w:pos="9026" w:leader="dot"/>
+        </w:tabs>
+        <w:spacing w:after="20" w:before="0"/>
+        <w:ind w:left="340"/>
+      </w:pPr>
+      <w:r>
+        <w:rPr>
+          <w:b w:val="false"/>
+          <w:bCs w:val="false"/>
+          <w:color w:val="6B7280"/>
+          <w:sz w:val="19"/>
+          <w:szCs w:val="19"/>
+        </w:rPr>
+        <w:t xml:space="preserve">9.10 Stripe</w:t>
+      </w:r>
+      <w:r>
+        <w:rPr>
+          <w:b w:val="false"/>
+          <w:bCs w:val="false"/>
+          <w:color w:val="6B7280"/>
+          <w:sz w:val="19"/>
+          <w:szCs w:val="19"/>
+        </w:rPr>
+        <w:t xml:space="preserve">	16</w:t>
+      </w:r>
+    </w:p>
+    <w:p>
+      <w:pPr>
+        <w:tabs>
+          <w:tab w:val="right" w:pos="9026" w:leader="dot"/>
+        </w:tabs>
+        <w:spacing w:after="20" w:before="0"/>
+        <w:ind w:left="340"/>
+      </w:pPr>
+      <w:r>
+        <w:rPr>
+          <w:b w:val="false"/>
+          <w:bCs w:val="false"/>
+          <w:color w:val="6B7280"/>
+          <w:sz w:val="19"/>
+          <w:szCs w:val="19"/>
+        </w:rPr>
+        <w:t xml:space="preserve">9.11 Email</w:t>
+      </w:r>
+      <w:r>
+        <w:rPr>
+          <w:b w:val="false"/>
+          <w:bCs w:val="false"/>
+          <w:color w:val="6B7280"/>
+          <w:sz w:val="19"/>
+          <w:szCs w:val="19"/>
+        </w:rPr>
+        <w:t xml:space="preserve">	17</w:t>
+      </w:r>
+    </w:p>
+    <w:p>
+      <w:pPr>
+        <w:tabs>
+          <w:tab w:val="right" w:pos="9026" w:leader="dot"/>
+        </w:tabs>
+        <w:spacing w:after="20" w:before="0"/>
+        <w:ind w:left="340"/>
+      </w:pPr>
+      <w:r>
+        <w:rPr>
+          <w:b w:val="false"/>
+          <w:bCs w:val="false"/>
+          <w:color w:val="6B7280"/>
+          <w:sz w:val="19"/>
+          <w:szCs w:val="19"/>
+        </w:rPr>
+        <w:t xml:space="preserve">9.12 Storage and CDN</w:t>
+      </w:r>
+      <w:r>
+        <w:rPr>
+          <w:b w:val="false"/>
+          <w:bCs w:val="false"/>
+          <w:color w:val="6B7280"/>
+          <w:sz w:val="19"/>
+          <w:szCs w:val="19"/>
+        </w:rPr>
+        <w:t xml:space="preserve">	17</w:t>
+      </w:r>
+    </w:p>
+    <w:p>
+      <w:pPr>
+        <w:tabs>
+          <w:tab w:val="right" w:pos="9026" w:leader="dot"/>
+        </w:tabs>
+        <w:spacing w:after="20" w:before="0"/>
+        <w:ind w:left="340"/>
+      </w:pPr>
+      <w:r>
+        <w:rPr>
+          <w:b w:val="false"/>
+          <w:bCs w:val="false"/>
+          <w:color w:val="6B7280"/>
+          <w:sz w:val="19"/>
+          <w:szCs w:val="19"/>
+        </w:rPr>
+        <w:t xml:space="preserve">9.13 Sign-in providers (optional)</w:t>
+      </w:r>
+      <w:r>
+        <w:rPr>
+          <w:b w:val="false"/>
+          <w:bCs w:val="false"/>
+          <w:color w:val="6B7280"/>
+          <w:sz w:val="19"/>
+          <w:szCs w:val="19"/>
+        </w:rPr>
+        <w:t xml:space="preserve">	17</w:t>
+      </w:r>
+    </w:p>
+    <w:p>
+      <w:pPr>
+        <w:tabs>
+          <w:tab w:val="right" w:pos="9026" w:leader="dot"/>
+        </w:tabs>
+        <w:spacing w:after="20" w:before="0"/>
+        <w:ind w:left="340"/>
+      </w:pPr>
+      <w:r>
+        <w:rPr>
+          <w:b w:val="false"/>
+          <w:bCs w:val="false"/>
+          <w:color w:val="6B7280"/>
+          <w:sz w:val="19"/>
+          <w:szCs w:val="19"/>
+        </w:rPr>
+        <w:t xml:space="preserve">9.14 Callback URL reference</w:t>
+      </w:r>
+      <w:r>
+        <w:rPr>
+          <w:b w:val="false"/>
+          <w:bCs w:val="false"/>
+          <w:color w:val="6B7280"/>
+          <w:sz w:val="19"/>
+          <w:szCs w:val="19"/>
+        </w:rPr>
+        <w:t xml:space="preserve">	17</w:t>
+      </w:r>
+    </w:p>
+    <w:p>
+      <w:pPr>
+        <w:tabs>
+          <w:tab w:val="right" w:pos="9026" w:leader="dot"/>
+        </w:tabs>
+        <w:spacing w:after="60" w:before="100"/>
+        <w:ind w:left="0"/>
+      </w:pPr>
+      <w:r>
+        <w:rPr>
+          <w:b/>
+          <w:bCs/>
+          <w:color w:val="0B1F4B"/>
+          <w:sz w:val="21"/>
+          <w:szCs w:val="21"/>
+        </w:rPr>
+        <w:t xml:space="preserve">10. Feature reference</w:t>
+      </w:r>
+      <w:r>
+        <w:rPr>
+          <w:b/>
+          <w:bCs/>
+          <w:color w:val="0B1F4B"/>
+          <w:sz w:val="21"/>
+          <w:szCs w:val="21"/>
+        </w:rPr>
+        <w:t xml:space="preserve">	18</w:t>
+      </w:r>
+    </w:p>
+    <w:p>
+      <w:pPr>
+        <w:tabs>
+          <w:tab w:val="right" w:pos="9026" w:leader="dot"/>
+        </w:tabs>
+        <w:spacing w:after="20" w:before="0"/>
+        <w:ind w:left="340"/>
+      </w:pPr>
+      <w:r>
+        <w:rPr>
+          <w:b w:val="false"/>
+          <w:bCs w:val="false"/>
+          <w:color w:val="6B7280"/>
+          <w:sz w:val="19"/>
+          <w:szCs w:val="19"/>
+        </w:rPr>
+        <w:t xml:space="preserve">10.1 Authentication and tenancy</w:t>
+      </w:r>
+      <w:r>
+        <w:rPr>
+          <w:b w:val="false"/>
+          <w:bCs w:val="false"/>
+          <w:color w:val="6B7280"/>
+          <w:sz w:val="19"/>
+          <w:szCs w:val="19"/>
+        </w:rPr>
+        <w:t xml:space="preserve">	18</w:t>
+      </w:r>
+    </w:p>
+    <w:p>
+      <w:pPr>
+        <w:tabs>
+          <w:tab w:val="right" w:pos="9026" w:leader="dot"/>
+        </w:tabs>
+        <w:spacing w:after="20" w:before="0"/>
+        <w:ind w:left="340"/>
+      </w:pPr>
+      <w:r>
+        <w:rPr>
+          <w:b w:val="false"/>
+          <w:bCs w:val="false"/>
+          <w:color w:val="6B7280"/>
+          <w:sz w:val="19"/>
+          <w:szCs w:val="19"/>
+        </w:rPr>
+        <w:t xml:space="preserve">10.2 Onboarding and the Company Profile</w:t>
+      </w:r>
+      <w:r>
+        <w:rPr>
+          <w:b w:val="false"/>
+          <w:bCs w:val="false"/>
+          <w:color w:val="6B7280"/>
+          <w:sz w:val="19"/>
+          <w:szCs w:val="19"/>
+        </w:rPr>
+        <w:t xml:space="preserve">	19</w:t>
+      </w:r>
+    </w:p>
+    <w:p>
+      <w:pPr>
+        <w:tabs>
+          <w:tab w:val="right" w:pos="9026" w:leader="dot"/>
+        </w:tabs>
+        <w:spacing w:after="20" w:before="0"/>
+        <w:ind w:left="340"/>
+      </w:pPr>
+      <w:r>
+        <w:rPr>
+          <w:b w:val="false"/>
+          <w:bCs w:val="false"/>
+          <w:color w:val="6B7280"/>
+          <w:sz w:val="19"/>
+          <w:szCs w:val="19"/>
+        </w:rPr>
+        <w:t xml:space="preserve">10.3 Generation engine</w:t>
+      </w:r>
+      <w:r>
+        <w:rPr>
+          <w:b w:val="false"/>
+          <w:bCs w:val="false"/>
+          <w:color w:val="6B7280"/>
+          <w:sz w:val="19"/>
+          <w:szCs w:val="19"/>
+        </w:rPr>
+        <w:t xml:space="preserve">	19</w:t>
+      </w:r>
+    </w:p>
+    <w:p>
+      <w:pPr>
+        <w:tabs>
+          <w:tab w:val="right" w:pos="9026" w:leader="dot"/>
+        </w:tabs>
+        <w:spacing w:after="20" w:before="0"/>
+        <w:ind w:left="340"/>
+      </w:pPr>
+      <w:r>
+        <w:rPr>
+          <w:b w:val="false"/>
+          <w:bCs w:val="false"/>
+          <w:color w:val="6B7280"/>
+          <w:sz w:val="19"/>
+          <w:szCs w:val="19"/>
+        </w:rPr>
+        <w:t xml:space="preserve">10.4 Velocity mode (swipe approval)</w:t>
+      </w:r>
+      <w:r>
+        <w:rPr>
+          <w:b w:val="false"/>
+          <w:bCs w:val="false"/>
+          <w:color w:val="6B7280"/>
+          <w:sz w:val="19"/>
+          <w:szCs w:val="19"/>
+        </w:rPr>
+        <w:t xml:space="preserve">	20</w:t>
+      </w:r>
+    </w:p>
+    <w:p>
+      <w:pPr>
+        <w:tabs>
+          <w:tab w:val="right" w:pos="9026" w:leader="dot"/>
+        </w:tabs>
+        <w:spacing w:after="20" w:before="0"/>
+        <w:ind w:left="340"/>
+      </w:pPr>
+      <w:r>
+        <w:rPr>
+          <w:b w:val="false"/>
+          <w:bCs w:val="false"/>
+          <w:color w:val="6B7280"/>
+          <w:sz w:val="19"/>
+          <w:szCs w:val="19"/>
+        </w:rPr>
+        <w:t xml:space="preserve">10.5 Content library, editing and Studio</w:t>
+      </w:r>
+      <w:r>
+        <w:rPr>
+          <w:b w:val="false"/>
+          <w:bCs w:val="false"/>
+          <w:color w:val="6B7280"/>
+          <w:sz w:val="19"/>
+          <w:szCs w:val="19"/>
+        </w:rPr>
+        <w:t xml:space="preserve">	20</w:t>
+      </w:r>
+    </w:p>
+    <w:p>
+      <w:pPr>
+        <w:tabs>
+          <w:tab w:val="right" w:pos="9026" w:leader="dot"/>
+        </w:tabs>
+        <w:spacing w:after="20" w:before="0"/>
+        <w:ind w:left="340"/>
+      </w:pPr>
+      <w:r>
+        <w:rPr>
+          <w:b w:val="false"/>
+          <w:bCs w:val="false"/>
+          <w:color w:val="6B7280"/>
+          <w:sz w:val="19"/>
+          <w:szCs w:val="19"/>
+        </w:rPr>
+        <w:t xml:space="preserve">10.6 Social accounts and publishing</w:t>
+      </w:r>
+      <w:r>
+        <w:rPr>
+          <w:b w:val="false"/>
+          <w:bCs w:val="false"/>
+          <w:color w:val="6B7280"/>
+          <w:sz w:val="19"/>
+          <w:szCs w:val="19"/>
+        </w:rPr>
+        <w:t xml:space="preserve">	21</w:t>
+      </w:r>
+    </w:p>
+    <w:p>
+      <w:pPr>
+        <w:tabs>
+          <w:tab w:val="right" w:pos="9026" w:leader="dot"/>
+        </w:tabs>
+        <w:spacing w:after="20" w:before="0"/>
+        <w:ind w:left="340"/>
+      </w:pPr>
+      <w:r>
+        <w:rPr>
+          <w:b w:val="false"/>
+          <w:bCs w:val="false"/>
+          <w:color w:val="6B7280"/>
+          <w:sz w:val="19"/>
+          <w:szCs w:val="19"/>
+        </w:rPr>
+        <w:t xml:space="preserve">10.7 Automations</w:t>
+      </w:r>
+      <w:r>
+        <w:rPr>
+          <w:b w:val="false"/>
+          <w:bCs w:val="false"/>
+          <w:color w:val="6B7280"/>
+          <w:sz w:val="19"/>
+          <w:szCs w:val="19"/>
+        </w:rPr>
+        <w:t xml:space="preserve">	21</w:t>
+      </w:r>
+    </w:p>
+    <w:p>
+      <w:pPr>
+        <w:tabs>
+          <w:tab w:val="right" w:pos="9026" w:leader="dot"/>
+        </w:tabs>
+        <w:spacing w:after="20" w:before="0"/>
+        <w:ind w:left="340"/>
+      </w:pPr>
+      <w:r>
+        <w:rPr>
+          <w:b w:val="false"/>
+          <w:bCs w:val="false"/>
+          <w:color w:val="6B7280"/>
+          <w:sz w:val="19"/>
+          <w:szCs w:val="19"/>
+        </w:rPr>
+        <w:t xml:space="preserve">10.8 Analytics and attribution</w:t>
+      </w:r>
+      <w:r>
+        <w:rPr>
+          <w:b w:val="false"/>
+          <w:bCs w:val="false"/>
+          <w:color w:val="6B7280"/>
+          <w:sz w:val="19"/>
+          <w:szCs w:val="19"/>
+        </w:rPr>
+        <w:t xml:space="preserve">	22</w:t>
+      </w:r>
+    </w:p>
+    <w:p>
+      <w:pPr>
+        <w:tabs>
+          <w:tab w:val="right" w:pos="9026" w:leader="dot"/>
+        </w:tabs>
+        <w:spacing w:after="20" w:before="0"/>
+        <w:ind w:left="340"/>
+      </w:pPr>
+      <w:r>
+        <w:rPr>
+          <w:b w:val="false"/>
+          <w:bCs w:val="false"/>
+          <w:color w:val="6B7280"/>
+          <w:sz w:val="19"/>
+          <w:szCs w:val="19"/>
+        </w:rPr>
+        <w:t xml:space="preserve">10.9 Trends, characters and clips</w:t>
+      </w:r>
+      <w:r>
+        <w:rPr>
+          <w:b w:val="false"/>
+          <w:bCs w:val="false"/>
+          <w:color w:val="6B7280"/>
+          <w:sz w:val="19"/>
+          <w:szCs w:val="19"/>
+        </w:rPr>
+        <w:t xml:space="preserve">	22</w:t>
+      </w:r>
+    </w:p>
+    <w:p>
+      <w:pPr>
+        <w:tabs>
+          <w:tab w:val="right" w:pos="9026" w:leader="dot"/>
+        </w:tabs>
+        <w:spacing w:after="20" w:before="0"/>
+        <w:ind w:left="340"/>
+      </w:pPr>
+      <w:r>
+        <w:rPr>
+          <w:b w:val="false"/>
+          <w:bCs w:val="false"/>
+          <w:color w:val="6B7280"/>
+          <w:sz w:val="19"/>
+          <w:szCs w:val="19"/>
+        </w:rPr>
+        <w:t xml:space="preserve">10.10 Plans, entitlements and credits</w:t>
+      </w:r>
+      <w:r>
+        <w:rPr>
+          <w:b w:val="false"/>
+          <w:bCs w:val="false"/>
+          <w:color w:val="6B7280"/>
+          <w:sz w:val="19"/>
+          <w:szCs w:val="19"/>
+        </w:rPr>
+        <w:t xml:space="preserve">	23</w:t>
+      </w:r>
+    </w:p>
+    <w:p>
+      <w:pPr>
+        <w:tabs>
+          <w:tab w:val="right" w:pos="9026" w:leader="dot"/>
+        </w:tabs>
+        <w:spacing w:after="20" w:before="0"/>
+        <w:ind w:left="340"/>
+      </w:pPr>
+      <w:r>
+        <w:rPr>
+          <w:b w:val="false"/>
+          <w:bCs w:val="false"/>
+          <w:color w:val="6B7280"/>
+          <w:sz w:val="19"/>
+          <w:szCs w:val="19"/>
+        </w:rPr>
+        <w:t xml:space="preserve">10.11 Affiliates</w:t>
+      </w:r>
+      <w:r>
+        <w:rPr>
+          <w:b w:val="false"/>
+          <w:bCs w:val="false"/>
+          <w:color w:val="6B7280"/>
+          <w:sz w:val="19"/>
+          <w:szCs w:val="19"/>
+        </w:rPr>
+        <w:t xml:space="preserve">	24</w:t>
+      </w:r>
+    </w:p>
+    <w:p>
+      <w:pPr>
+        <w:tabs>
+          <w:tab w:val="right" w:pos="9026" w:leader="dot"/>
+        </w:tabs>
+        <w:spacing w:after="20" w:before="0"/>
+        <w:ind w:left="340"/>
+      </w:pPr>
+      <w:r>
+        <w:rPr>
+          <w:b w:val="false"/>
+          <w:bCs w:val="false"/>
+          <w:color w:val="6B7280"/>
+          <w:sz w:val="19"/>
+          <w:szCs w:val="19"/>
+        </w:rPr>
+        <w:t xml:space="preserve">10.12 Notifications and the weekly digest</w:t>
+      </w:r>
+      <w:r>
+        <w:rPr>
+          <w:b w:val="false"/>
+          <w:bCs w:val="false"/>
+          <w:color w:val="6B7280"/>
+          <w:sz w:val="19"/>
+          <w:szCs w:val="19"/>
+        </w:rPr>
+        <w:t xml:space="preserve">	24</w:t>
+      </w:r>
+    </w:p>
+    <w:p>
+      <w:pPr>
+        <w:tabs>
+          <w:tab w:val="right" w:pos="9026" w:leader="dot"/>
+        </w:tabs>
+        <w:spacing w:after="20" w:before="0"/>
+        <w:ind w:left="340"/>
+      </w:pPr>
+      <w:r>
+        <w:rPr>
+          <w:b w:val="false"/>
+          <w:bCs w:val="false"/>
+          <w:color w:val="6B7280"/>
+          <w:sz w:val="19"/>
+          <w:szCs w:val="19"/>
+        </w:rPr>
+        <w:t xml:space="preserve">10.13 Admin panel</w:t>
+      </w:r>
+      <w:r>
+        <w:rPr>
+          <w:b w:val="false"/>
+          <w:bCs w:val="false"/>
+          <w:color w:val="6B7280"/>
+          <w:sz w:val="19"/>
+          <w:szCs w:val="19"/>
+        </w:rPr>
+        <w:t xml:space="preserve">	24</w:t>
+      </w:r>
+    </w:p>
+    <w:p>
+      <w:pPr>
+        <w:tabs>
+          <w:tab w:val="right" w:pos="9026" w:leader="dot"/>
+        </w:tabs>
+        <w:spacing w:after="60" w:before="100"/>
+        <w:ind w:left="0"/>
+      </w:pPr>
+      <w:r>
+        <w:rPr>
+          <w:b/>
+          <w:bCs/>
+          <w:color w:val="0B1F4B"/>
+          <w:sz w:val="21"/>
+          <w:szCs w:val="21"/>
+        </w:rPr>
+        <w:t xml:space="preserve">11. REST API reference</w:t>
+      </w:r>
+      <w:r>
+        <w:rPr>
+          <w:b/>
+          <w:bCs/>
+          <w:color w:val="0B1F4B"/>
+          <w:sz w:val="21"/>
+          <w:szCs w:val="21"/>
+        </w:rPr>
+        <w:t xml:space="preserve">	26</w:t>
+      </w:r>
+    </w:p>
+    <w:p>
+      <w:pPr>
+        <w:tabs>
+          <w:tab w:val="right" w:pos="9026" w:leader="dot"/>
+        </w:tabs>
+        <w:spacing w:after="20" w:before="0"/>
+        <w:ind w:left="340"/>
+      </w:pPr>
+      <w:r>
+        <w:rPr>
+          <w:b w:val="false"/>
+          <w:bCs w:val="false"/>
+          <w:color w:val="6B7280"/>
+          <w:sz w:val="19"/>
+          <w:szCs w:val="19"/>
+        </w:rPr>
+        <w:t xml:space="preserve">11.1 Conventions</w:t>
+      </w:r>
+      <w:r>
+        <w:rPr>
+          <w:b w:val="false"/>
+          <w:bCs w:val="false"/>
+          <w:color w:val="6B7280"/>
+          <w:sz w:val="19"/>
+          <w:szCs w:val="19"/>
+        </w:rPr>
+        <w:t xml:space="preserve">	26</w:t>
+      </w:r>
+    </w:p>
+    <w:p>
+      <w:pPr>
+        <w:tabs>
+          <w:tab w:val="right" w:pos="9026" w:leader="dot"/>
+        </w:tabs>
+        <w:spacing w:after="20" w:before="0"/>
+        <w:ind w:left="340"/>
+      </w:pPr>
+      <w:r>
+        <w:rPr>
+          <w:b w:val="false"/>
+          <w:bCs w:val="false"/>
+          <w:color w:val="6B7280"/>
+          <w:sz w:val="19"/>
+          <w:szCs w:val="19"/>
+        </w:rPr>
+        <w:t xml:space="preserve">11.2 Status codes</w:t>
+      </w:r>
+      <w:r>
+        <w:rPr>
+          <w:b w:val="false"/>
+          <w:bCs w:val="false"/>
+          <w:color w:val="6B7280"/>
+          <w:sz w:val="19"/>
+          <w:szCs w:val="19"/>
+        </w:rPr>
+        <w:t xml:space="preserve">	26</w:t>
+      </w:r>
+    </w:p>
+    <w:p>
+      <w:pPr>
+        <w:tabs>
+          <w:tab w:val="right" w:pos="9026" w:leader="dot"/>
+        </w:tabs>
+        <w:spacing w:after="20" w:before="0"/>
+        <w:ind w:left="340"/>
+      </w:pPr>
+      <w:r>
+        <w:rPr>
+          <w:b w:val="false"/>
+          <w:bCs w:val="false"/>
+          <w:color w:val="6B7280"/>
+          <w:sz w:val="19"/>
+          <w:szCs w:val="19"/>
+        </w:rPr>
+        <w:t xml:space="preserve">11.3 Complete endpoint index</w:t>
+      </w:r>
+      <w:r>
+        <w:rPr>
+          <w:b w:val="false"/>
+          <w:bCs w:val="false"/>
+          <w:color w:val="6B7280"/>
+          <w:sz w:val="19"/>
+          <w:szCs w:val="19"/>
+        </w:rPr>
+        <w:t xml:space="preserve">	27</w:t>
+      </w:r>
+    </w:p>
+    <w:p>
+      <w:pPr>
+        <w:tabs>
+          <w:tab w:val="right" w:pos="9026" w:leader="dot"/>
+        </w:tabs>
+        <w:spacing w:after="20" w:before="0"/>
+        <w:ind w:left="340"/>
+      </w:pPr>
+      <w:r>
+        <w:rPr>
+          <w:b w:val="false"/>
+          <w:bCs w:val="false"/>
+          <w:color w:val="6B7280"/>
+          <w:sz w:val="19"/>
+          <w:szCs w:val="19"/>
+        </w:rPr>
+        <w:t xml:space="preserve">11.4 Worked example: generate and publish via the API</w:t>
+      </w:r>
+      <w:r>
+        <w:rPr>
+          <w:b w:val="false"/>
+          <w:bCs w:val="false"/>
+          <w:color w:val="6B7280"/>
+          <w:sz w:val="19"/>
+          <w:szCs w:val="19"/>
+        </w:rPr>
+        <w:t xml:space="preserve">	29</w:t>
+      </w:r>
+    </w:p>
+    <w:p>
+      <w:pPr>
+        <w:tabs>
+          <w:tab w:val="right" w:pos="9026" w:leader="dot"/>
+        </w:tabs>
+        <w:spacing w:after="60" w:before="100"/>
+        <w:ind w:left="0"/>
+      </w:pPr>
+      <w:r>
+        <w:rPr>
+          <w:b/>
+          <w:bCs/>
+          <w:color w:val="0B1F4B"/>
+          <w:sz w:val="21"/>
+          <w:szCs w:val="21"/>
+        </w:rPr>
+        <w:t xml:space="preserve">12. Webhooks</w:t>
+      </w:r>
+      <w:r>
+        <w:rPr>
+          <w:b/>
+          <w:bCs/>
+          <w:color w:val="0B1F4B"/>
+          <w:sz w:val="21"/>
+          <w:szCs w:val="21"/>
+        </w:rPr>
+        <w:t xml:space="preserve">	31</w:t>
+      </w:r>
+    </w:p>
+    <w:p>
+      <w:pPr>
+        <w:tabs>
+          <w:tab w:val="right" w:pos="9026" w:leader="dot"/>
+        </w:tabs>
+        <w:spacing w:after="20" w:before="0"/>
+        <w:ind w:left="340"/>
+      </w:pPr>
+      <w:r>
+        <w:rPr>
+          <w:b w:val="false"/>
+          <w:bCs w:val="false"/>
+          <w:color w:val="6B7280"/>
+          <w:sz w:val="19"/>
+          <w:szCs w:val="19"/>
+        </w:rPr>
+        <w:t xml:space="preserve">12.1 Verifying a signature</w:t>
+      </w:r>
+      <w:r>
+        <w:rPr>
+          <w:b w:val="false"/>
+          <w:bCs w:val="false"/>
+          <w:color w:val="6B7280"/>
+          <w:sz w:val="19"/>
+          <w:szCs w:val="19"/>
+        </w:rPr>
+        <w:t xml:space="preserve">	31</w:t>
+      </w:r>
+    </w:p>
+    <w:p>
+      <w:pPr>
+        <w:tabs>
+          <w:tab w:val="right" w:pos="9026" w:leader="dot"/>
+        </w:tabs>
+        <w:spacing w:after="60" w:before="100"/>
+        <w:ind w:left="0"/>
+      </w:pPr>
+      <w:r>
+        <w:rPr>
+          <w:b/>
+          <w:bCs/>
+          <w:color w:val="0B1F4B"/>
+          <w:sz w:val="21"/>
+          <w:szCs w:val="21"/>
+        </w:rPr>
+        <w:t xml:space="preserve">13. MCP server (AI agents)</w:t>
+      </w:r>
+      <w:r>
+        <w:rPr>
+          <w:b/>
+          <w:bCs/>
+          <w:color w:val="0B1F4B"/>
+          <w:sz w:val="21"/>
+          <w:szCs w:val="21"/>
+        </w:rPr>
+        <w:t xml:space="preserve">	32</w:t>
+      </w:r>
+    </w:p>
+    <w:p>
+      <w:pPr>
+        <w:tabs>
+          <w:tab w:val="right" w:pos="9026" w:leader="dot"/>
+        </w:tabs>
+        <w:spacing w:after="60" w:before="100"/>
+        <w:ind w:left="0"/>
+      </w:pPr>
+      <w:r>
+        <w:rPr>
+          <w:b/>
+          <w:bCs/>
+          <w:color w:val="0B1F4B"/>
+          <w:sz w:val="21"/>
+          <w:szCs w:val="21"/>
+        </w:rPr>
+        <w:t xml:space="preserve">14. Website tracking and attribution</w:t>
+      </w:r>
+      <w:r>
+        <w:rPr>
+          <w:b/>
+          <w:bCs/>
+          <w:color w:val="0B1F4B"/>
+          <w:sz w:val="21"/>
+          <w:szCs w:val="21"/>
+        </w:rPr>
+        <w:t xml:space="preserve">	33</w:t>
+      </w:r>
+    </w:p>
+    <w:p>
+      <w:pPr>
+        <w:tabs>
+          <w:tab w:val="right" w:pos="9026" w:leader="dot"/>
+        </w:tabs>
+        <w:spacing w:after="60" w:before="100"/>
+        <w:ind w:left="0"/>
+      </w:pPr>
+      <w:r>
+        <w:rPr>
+          <w:b/>
+          <w:bCs/>
+          <w:color w:val="0B1F4B"/>
+          <w:sz w:val="21"/>
+          <w:szCs w:val="21"/>
+        </w:rPr>
+        <w:t xml:space="preserve">15. Background jobs</w:t>
+      </w:r>
+      <w:r>
+        <w:rPr>
+          <w:b/>
+          <w:bCs/>
+          <w:color w:val="0B1F4B"/>
+          <w:sz w:val="21"/>
+          <w:szCs w:val="21"/>
+        </w:rPr>
+        <w:t xml:space="preserve">	34</w:t>
+      </w:r>
+    </w:p>
+    <w:p>
+      <w:pPr>
+        <w:tabs>
+          <w:tab w:val="right" w:pos="9026" w:leader="dot"/>
+        </w:tabs>
+        <w:spacing w:after="60" w:before="100"/>
+        <w:ind w:left="0"/>
+      </w:pPr>
+      <w:r>
+        <w:rPr>
+          <w:b/>
+          <w:bCs/>
+          <w:color w:val="0B1F4B"/>
+          <w:sz w:val="21"/>
+          <w:szCs w:val="21"/>
+        </w:rPr>
+        <w:t xml:space="preserve">16. Front-end map</w:t>
+      </w:r>
+      <w:r>
+        <w:rPr>
+          <w:b/>
+          <w:bCs/>
+          <w:color w:val="0B1F4B"/>
+          <w:sz w:val="21"/>
+          <w:szCs w:val="21"/>
+        </w:rPr>
+        <w:t xml:space="preserve">	35</w:t>
+      </w:r>
+    </w:p>
+    <w:p>
+      <w:pPr>
+        <w:tabs>
+          <w:tab w:val="right" w:pos="9026" w:leader="dot"/>
+        </w:tabs>
+        <w:spacing w:after="60" w:before="100"/>
+        <w:ind w:left="0"/>
+      </w:pPr>
+      <w:r>
+        <w:rPr>
+          <w:b/>
+          <w:bCs/>
+          <w:color w:val="0B1F4B"/>
+          <w:sz w:val="21"/>
+          <w:szCs w:val="21"/>
+        </w:rPr>
+        <w:t xml:space="preserve">17. Testing and verification</w:t>
+      </w:r>
+      <w:r>
+        <w:rPr>
+          <w:b/>
+          <w:bCs/>
+          <w:color w:val="0B1F4B"/>
+          <w:sz w:val="21"/>
+          <w:szCs w:val="21"/>
+        </w:rPr>
+        <w:t xml:space="preserve">	36</w:t>
+      </w:r>
+    </w:p>
+    <w:p>
+      <w:pPr>
+        <w:tabs>
+          <w:tab w:val="right" w:pos="9026" w:leader="dot"/>
+        </w:tabs>
+        <w:spacing w:after="20" w:before="0"/>
+        <w:ind w:left="340"/>
+      </w:pPr>
+      <w:r>
+        <w:rPr>
+          <w:b w:val="false"/>
+          <w:bCs w:val="false"/>
+          <w:color w:val="6B7280"/>
+          <w:sz w:val="19"/>
+          <w:szCs w:val="19"/>
+        </w:rPr>
+        <w:t xml:space="preserve">17.1 Continuous integration</w:t>
+      </w:r>
+      <w:r>
+        <w:rPr>
+          <w:b w:val="false"/>
+          <w:bCs w:val="false"/>
+          <w:color w:val="6B7280"/>
+          <w:sz w:val="19"/>
+          <w:szCs w:val="19"/>
+        </w:rPr>
+        <w:t xml:space="preserve">	36</w:t>
+      </w:r>
+    </w:p>
+    <w:p>
+      <w:pPr>
+        <w:tabs>
+          <w:tab w:val="right" w:pos="9026" w:leader="dot"/>
+        </w:tabs>
+        <w:spacing w:after="20" w:before="0"/>
+        <w:ind w:left="340"/>
+      </w:pPr>
+      <w:r>
+        <w:rPr>
+          <w:b w:val="false"/>
+          <w:bCs w:val="false"/>
+          <w:color w:val="6B7280"/>
+          <w:sz w:val="19"/>
+          <w:szCs w:val="19"/>
+        </w:rPr>
+        <w:t xml:space="preserve">17.2 End-to-end API suite</w:t>
+      </w:r>
+      <w:r>
+        <w:rPr>
+          <w:b w:val="false"/>
+          <w:bCs w:val="false"/>
+          <w:color w:val="6B7280"/>
+          <w:sz w:val="19"/>
+          <w:szCs w:val="19"/>
+        </w:rPr>
+        <w:t xml:space="preserve">	36</w:t>
+      </w:r>
+    </w:p>
+    <w:p>
+      <w:pPr>
+        <w:tabs>
+          <w:tab w:val="right" w:pos="9026" w:leader="dot"/>
+        </w:tabs>
+        <w:spacing w:after="20" w:before="0"/>
+        <w:ind w:left="340"/>
+      </w:pPr>
+      <w:r>
+        <w:rPr>
+          <w:b w:val="false"/>
+          <w:bCs w:val="false"/>
+          <w:color w:val="6B7280"/>
+          <w:sz w:val="19"/>
+          <w:szCs w:val="19"/>
+        </w:rPr>
+        <w:t xml:space="preserve">17.3 Billing simulation (no Stripe account needed)</w:t>
+      </w:r>
+      <w:r>
+        <w:rPr>
+          <w:b w:val="false"/>
+          <w:bCs w:val="false"/>
+          <w:color w:val="6B7280"/>
+          <w:sz w:val="19"/>
+          <w:szCs w:val="19"/>
+        </w:rPr>
+        <w:t xml:space="preserve">	36</w:t>
+      </w:r>
+    </w:p>
+    <w:p>
+      <w:pPr>
+        <w:tabs>
+          <w:tab w:val="right" w:pos="9026" w:leader="dot"/>
+        </w:tabs>
+        <w:spacing w:after="20" w:before="0"/>
+        <w:ind w:left="340"/>
+      </w:pPr>
+      <w:r>
+        <w:rPr>
+          <w:b w:val="false"/>
+          <w:bCs w:val="false"/>
+          <w:color w:val="6B7280"/>
+          <w:sz w:val="19"/>
+          <w:szCs w:val="19"/>
+        </w:rPr>
+        <w:t xml:space="preserve">17.4 Route crawl</w:t>
+      </w:r>
+      <w:r>
+        <w:rPr>
+          <w:b w:val="false"/>
+          <w:bCs w:val="false"/>
+          <w:color w:val="6B7280"/>
+          <w:sz w:val="19"/>
+          <w:szCs w:val="19"/>
+        </w:rPr>
+        <w:t xml:space="preserve">	36</w:t>
+      </w:r>
+    </w:p>
+    <w:p>
+      <w:pPr>
+        <w:tabs>
+          <w:tab w:val="right" w:pos="9026" w:leader="dot"/>
+        </w:tabs>
+        <w:spacing w:after="20" w:before="0"/>
+        <w:ind w:left="340"/>
+      </w:pPr>
+      <w:r>
+        <w:rPr>
+          <w:b w:val="false"/>
+          <w:bCs w:val="false"/>
+          <w:color w:val="6B7280"/>
+          <w:sz w:val="19"/>
+          <w:szCs w:val="19"/>
+        </w:rPr>
+        <w:t xml:space="preserve">17.5 Browser tests and screenshots</w:t>
+      </w:r>
+      <w:r>
+        <w:rPr>
+          <w:b w:val="false"/>
+          <w:bCs w:val="false"/>
+          <w:color w:val="6B7280"/>
+          <w:sz w:val="19"/>
+          <w:szCs w:val="19"/>
+        </w:rPr>
+        <w:t xml:space="preserve">	36</w:t>
+      </w:r>
+    </w:p>
+    <w:p>
+      <w:pPr>
+        <w:tabs>
+          <w:tab w:val="right" w:pos="9026" w:leader="dot"/>
+        </w:tabs>
+        <w:spacing w:after="20" w:before="0"/>
+        <w:ind w:left="340"/>
+      </w:pPr>
+      <w:r>
+        <w:rPr>
+          <w:b w:val="false"/>
+          <w:bCs w:val="false"/>
+          <w:color w:val="6B7280"/>
+          <w:sz w:val="19"/>
+          <w:szCs w:val="19"/>
+        </w:rPr>
+        <w:t xml:space="preserve">17.6 Release checklist</w:t>
+      </w:r>
+      <w:r>
+        <w:rPr>
+          <w:b w:val="false"/>
+          <w:bCs w:val="false"/>
+          <w:color w:val="6B7280"/>
+          <w:sz w:val="19"/>
+          <w:szCs w:val="19"/>
+        </w:rPr>
+        <w:t xml:space="preserve">	36</w:t>
+      </w:r>
+    </w:p>
+    <w:p>
+      <w:pPr>
+        <w:tabs>
+          <w:tab w:val="right" w:pos="9026" w:leader="dot"/>
+        </w:tabs>
+        <w:spacing w:after="60" w:before="100"/>
+        <w:ind w:left="0"/>
+      </w:pPr>
+      <w:r>
+        <w:rPr>
+          <w:b/>
+          <w:bCs/>
+          <w:color w:val="0B1F4B"/>
+          <w:sz w:val="21"/>
+          <w:szCs w:val="21"/>
+        </w:rPr>
+        <w:t xml:space="preserve">18. Operations</w:t>
+      </w:r>
+      <w:r>
+        <w:rPr>
+          <w:b/>
+          <w:bCs/>
+          <w:color w:val="0B1F4B"/>
+          <w:sz w:val="21"/>
+          <w:szCs w:val="21"/>
+        </w:rPr>
+        <w:t xml:space="preserve">	38</w:t>
+      </w:r>
+    </w:p>
+    <w:p>
+      <w:pPr>
+        <w:tabs>
+          <w:tab w:val="right" w:pos="9026" w:leader="dot"/>
+        </w:tabs>
+        <w:spacing w:after="20" w:before="0"/>
+        <w:ind w:left="340"/>
+      </w:pPr>
+      <w:r>
+        <w:rPr>
+          <w:b w:val="false"/>
+          <w:bCs w:val="false"/>
+          <w:color w:val="6B7280"/>
+          <w:sz w:val="19"/>
+          <w:szCs w:val="19"/>
+        </w:rPr>
+        <w:t xml:space="preserve">18.1 Scaling</w:t>
+      </w:r>
+      <w:r>
+        <w:rPr>
+          <w:b w:val="false"/>
+          <w:bCs w:val="false"/>
+          <w:color w:val="6B7280"/>
+          <w:sz w:val="19"/>
+          <w:szCs w:val="19"/>
+        </w:rPr>
+        <w:t xml:space="preserve">	38</w:t>
+      </w:r>
+    </w:p>
+    <w:p>
+      <w:pPr>
+        <w:tabs>
+          <w:tab w:val="right" w:pos="9026" w:leader="dot"/>
+        </w:tabs>
+        <w:spacing w:after="20" w:before="0"/>
+        <w:ind w:left="340"/>
+      </w:pPr>
+      <w:r>
+        <w:rPr>
+          <w:b w:val="false"/>
+          <w:bCs w:val="false"/>
+          <w:color w:val="6B7280"/>
+          <w:sz w:val="19"/>
+          <w:szCs w:val="19"/>
+        </w:rPr>
+        <w:t xml:space="preserve">18.2 Monitoring</w:t>
+      </w:r>
+      <w:r>
+        <w:rPr>
+          <w:b w:val="false"/>
+          <w:bCs w:val="false"/>
+          <w:color w:val="6B7280"/>
+          <w:sz w:val="19"/>
+          <w:szCs w:val="19"/>
+        </w:rPr>
+        <w:t xml:space="preserve">	38</w:t>
+      </w:r>
+    </w:p>
+    <w:p>
+      <w:pPr>
+        <w:tabs>
+          <w:tab w:val="right" w:pos="9026" w:leader="dot"/>
+        </w:tabs>
+        <w:spacing w:after="20" w:before="0"/>
+        <w:ind w:left="340"/>
+      </w:pPr>
+      <w:r>
+        <w:rPr>
+          <w:b w:val="false"/>
+          <w:bCs w:val="false"/>
+          <w:color w:val="6B7280"/>
+          <w:sz w:val="19"/>
+          <w:szCs w:val="19"/>
+        </w:rPr>
+        <w:t xml:space="preserve">18.3 Routine tasks</w:t>
+      </w:r>
+      <w:r>
+        <w:rPr>
+          <w:b w:val="false"/>
+          <w:bCs w:val="false"/>
+          <w:color w:val="6B7280"/>
+          <w:sz w:val="19"/>
+          <w:szCs w:val="19"/>
+        </w:rPr>
+        <w:t xml:space="preserve">	38</w:t>
+      </w:r>
+    </w:p>
+    <w:p>
+      <w:pPr>
+        <w:tabs>
+          <w:tab w:val="right" w:pos="9026" w:leader="dot"/>
+        </w:tabs>
+        <w:spacing w:after="20" w:before="0"/>
+        <w:ind w:left="340"/>
+      </w:pPr>
+      <w:r>
+        <w:rPr>
+          <w:b w:val="false"/>
+          <w:bCs w:val="false"/>
+          <w:color w:val="6B7280"/>
+          <w:sz w:val="19"/>
+          <w:szCs w:val="19"/>
+        </w:rPr>
+        <w:t xml:space="preserve">18.4 Incident playbook</w:t>
+      </w:r>
+      <w:r>
+        <w:rPr>
+          <w:b w:val="false"/>
+          <w:bCs w:val="false"/>
+          <w:color w:val="6B7280"/>
+          <w:sz w:val="19"/>
+          <w:szCs w:val="19"/>
+        </w:rPr>
+        <w:t xml:space="preserve">	38</w:t>
+      </w:r>
+    </w:p>
+    <w:p>
+      <w:pPr>
+        <w:tabs>
+          <w:tab w:val="right" w:pos="9026" w:leader="dot"/>
+        </w:tabs>
+        <w:spacing w:after="60" w:before="100"/>
+        <w:ind w:left="0"/>
+      </w:pPr>
+      <w:r>
+        <w:rPr>
+          <w:b/>
+          <w:bCs/>
+          <w:color w:val="0B1F4B"/>
+          <w:sz w:val="21"/>
+          <w:szCs w:val="21"/>
+        </w:rPr>
+        <w:t xml:space="preserve">19. Security</w:t>
+      </w:r>
+      <w:r>
+        <w:rPr>
+          <w:b/>
+          <w:bCs/>
+          <w:color w:val="0B1F4B"/>
+          <w:sz w:val="21"/>
+          <w:szCs w:val="21"/>
+        </w:rPr>
+        <w:t xml:space="preserve">	39</w:t>
+      </w:r>
+    </w:p>
+    <w:p>
+      <w:pPr>
+        <w:tabs>
+          <w:tab w:val="right" w:pos="9026" w:leader="dot"/>
+        </w:tabs>
+        <w:spacing w:after="20" w:before="0"/>
+        <w:ind w:left="340"/>
+      </w:pPr>
+      <w:r>
+        <w:rPr>
+          <w:b w:val="false"/>
+          <w:bCs w:val="false"/>
+          <w:color w:val="6B7280"/>
+          <w:sz w:val="19"/>
+          <w:szCs w:val="19"/>
+        </w:rPr>
+        <w:t xml:space="preserve">19.1 Controls in place</w:t>
+      </w:r>
+      <w:r>
+        <w:rPr>
+          <w:b w:val="false"/>
+          <w:bCs w:val="false"/>
+          <w:color w:val="6B7280"/>
+          <w:sz w:val="19"/>
+          <w:szCs w:val="19"/>
+        </w:rPr>
+        <w:t xml:space="preserve">	39</w:t>
+      </w:r>
+    </w:p>
+    <w:p>
+      <w:pPr>
+        <w:tabs>
+          <w:tab w:val="right" w:pos="9026" w:leader="dot"/>
+        </w:tabs>
+        <w:spacing w:after="20" w:before="0"/>
+        <w:ind w:left="340"/>
+      </w:pPr>
+      <w:r>
+        <w:rPr>
+          <w:b w:val="false"/>
+          <w:bCs w:val="false"/>
+          <w:color w:val="6B7280"/>
+          <w:sz w:val="19"/>
+          <w:szCs w:val="19"/>
+        </w:rPr>
+        <w:t xml:space="preserve">19.2 Before you go live</w:t>
+      </w:r>
+      <w:r>
+        <w:rPr>
+          <w:b w:val="false"/>
+          <w:bCs w:val="false"/>
+          <w:color w:val="6B7280"/>
+          <w:sz w:val="19"/>
+          <w:szCs w:val="19"/>
+        </w:rPr>
+        <w:t xml:space="preserve">	39</w:t>
+      </w:r>
+    </w:p>
+    <w:p>
+      <w:pPr>
+        <w:tabs>
+          <w:tab w:val="right" w:pos="9026" w:leader="dot"/>
+        </w:tabs>
+        <w:spacing w:after="20" w:before="0"/>
+        <w:ind w:left="340"/>
+      </w:pPr>
+      <w:r>
+        <w:rPr>
+          <w:b w:val="false"/>
+          <w:bCs w:val="false"/>
+          <w:color w:val="6B7280"/>
+          <w:sz w:val="19"/>
+          <w:szCs w:val="19"/>
+        </w:rPr>
+        <w:t xml:space="preserve">19.3 Key rotation</w:t>
+      </w:r>
+      <w:r>
+        <w:rPr>
+          <w:b w:val="false"/>
+          <w:bCs w:val="false"/>
+          <w:color w:val="6B7280"/>
+          <w:sz w:val="19"/>
+          <w:szCs w:val="19"/>
+        </w:rPr>
+        <w:t xml:space="preserve">	39</w:t>
+      </w:r>
+    </w:p>
+    <w:p>
+      <w:pPr>
+        <w:tabs>
+          <w:tab w:val="right" w:pos="9026" w:leader="dot"/>
+        </w:tabs>
+        <w:spacing w:after="60" w:before="100"/>
+        <w:ind w:left="0"/>
+      </w:pPr>
+      <w:r>
+        <w:rPr>
+          <w:b/>
+          <w:bCs/>
+          <w:color w:val="0B1F4B"/>
+          <w:sz w:val="21"/>
+          <w:szCs w:val="21"/>
+        </w:rPr>
+        <w:t xml:space="preserve">20. Extending the system</w:t>
+      </w:r>
+      <w:r>
+        <w:rPr>
+          <w:b/>
+          <w:bCs/>
+          <w:color w:val="0B1F4B"/>
+          <w:sz w:val="21"/>
+          <w:szCs w:val="21"/>
+        </w:rPr>
+        <w:t xml:space="preserve">	40</w:t>
+      </w:r>
+    </w:p>
+    <w:p>
+      <w:pPr>
+        <w:tabs>
+          <w:tab w:val="right" w:pos="9026" w:leader="dot"/>
+        </w:tabs>
+        <w:spacing w:after="60" w:before="100"/>
+        <w:ind w:left="0"/>
+      </w:pPr>
+      <w:r>
+        <w:rPr>
+          <w:b/>
+          <w:bCs/>
+          <w:color w:val="0B1F4B"/>
+          <w:sz w:val="21"/>
+          <w:szCs w:val="21"/>
+        </w:rPr>
+        <w:t xml:space="preserve">21. Troubleshooting</w:t>
+      </w:r>
+      <w:r>
+        <w:rPr>
+          <w:b/>
+          <w:bCs/>
+          <w:color w:val="0B1F4B"/>
+          <w:sz w:val="21"/>
+          <w:szCs w:val="21"/>
+        </w:rPr>
+        <w:t xml:space="preserve">	41</w:t>
+      </w:r>
+    </w:p>
+    <w:p>
+      <w:pPr>
+        <w:tabs>
+          <w:tab w:val="right" w:pos="9026" w:leader="dot"/>
+        </w:tabs>
+        <w:spacing w:after="60" w:before="100"/>
+        <w:ind w:left="0"/>
+      </w:pPr>
+      <w:r>
+        <w:rPr>
+          <w:b/>
+          <w:bCs/>
+          <w:color w:val="0B1F4B"/>
+          <w:sz w:val="21"/>
+          <w:szCs w:val="21"/>
+        </w:rPr>
+        <w:t xml:space="preserve">22. Appendix: quick command reference</w:t>
+      </w:r>
+      <w:r>
+        <w:rPr>
+          <w:b/>
+          <w:bCs/>
+          <w:color w:val="0B1F4B"/>
+          <w:sz w:val="21"/>
+          <w:szCs w:val="21"/>
+        </w:rPr>
+        <w:t xml:space="preserve">	42</w:t>
+      </w:r>
+    </w:p>
     <w:p>
       <w:r>
         <w:br w:type="page"/>

</xml_diff>